<commit_message>
Agregado de modulos y logica en el sql y otros detalles en el documento de word
</commit_message>
<xml_diff>
--- a/doc/Logica de la Aplicacion de Cobranzas.docx
+++ b/doc/Logica de la Aplicacion de Cobranzas.docx
@@ -80,7 +80,6 @@
           <w:szCs w:val="28"/>
         </w:rPr>
       </w:pPr>
-      <w:proofErr w:type="spellStart"/>
       <w:r>
         <w:rPr>
           <w:sz w:val="28"/>
@@ -88,7 +87,6 @@
         </w:rPr>
         <w:t>Admin</w:t>
       </w:r>
-      <w:proofErr w:type="spellEnd"/>
     </w:p>
     <w:p>
       <w:pPr>
@@ -162,7 +160,6 @@
           <w:szCs w:val="28"/>
         </w:rPr>
       </w:pPr>
-      <w:proofErr w:type="spellStart"/>
       <w:r>
         <w:rPr>
           <w:sz w:val="28"/>
@@ -177,7 +174,6 @@
         </w:rPr>
         <w:t>_p</w:t>
       </w:r>
-      <w:proofErr w:type="spellEnd"/>
     </w:p>
     <w:p>
       <w:pPr>
@@ -191,7 +187,6 @@
           <w:szCs w:val="28"/>
         </w:rPr>
       </w:pPr>
-      <w:proofErr w:type="spellStart"/>
       <w:r>
         <w:rPr>
           <w:sz w:val="28"/>
@@ -206,7 +201,6 @@
         </w:rPr>
         <w:t>_Yanbal</w:t>
       </w:r>
-      <w:proofErr w:type="spellEnd"/>
     </w:p>
     <w:p>
       <w:pPr>
@@ -391,7 +385,6 @@
                 <w14:ligatures w14:val="none"/>
               </w:rPr>
             </w:pPr>
-            <w:proofErr w:type="spellStart"/>
             <w:r>
               <w:rPr>
                 <w:rFonts w:ascii="Calibri" w:eastAsia="Times New Roman" w:hAnsi="Calibri" w:cs="Calibri"/>
@@ -402,7 +395,6 @@
               </w:rPr>
               <w:t>Telefono</w:t>
             </w:r>
-            <w:proofErr w:type="spellEnd"/>
           </w:p>
         </w:tc>
         <w:tc>
@@ -548,7 +540,6 @@
         </w:rPr>
         <w:t xml:space="preserve">Con la tabla </w:t>
       </w:r>
-      <w:proofErr w:type="spellStart"/>
       <w:r>
         <w:rPr>
           <w:b/>
@@ -558,7 +549,6 @@
         </w:rPr>
         <w:t>Admin</w:t>
       </w:r>
-      <w:proofErr w:type="spellEnd"/>
       <w:r>
         <w:rPr>
           <w:b/>
@@ -582,23 +572,7 @@
           <w:sz w:val="28"/>
           <w:szCs w:val="28"/>
         </w:rPr>
-        <w:t xml:space="preserve">Todo lo relacionado con la tabla </w:t>
-      </w:r>
-      <w:proofErr w:type="spellStart"/>
-      <w:r>
-        <w:rPr>
-          <w:sz w:val="28"/>
-          <w:szCs w:val="28"/>
-        </w:rPr>
-        <w:t>admin</w:t>
-      </w:r>
-      <w:proofErr w:type="spellEnd"/>
-      <w:r>
-        <w:rPr>
-          <w:sz w:val="28"/>
-          <w:szCs w:val="28"/>
-        </w:rPr>
-        <w:t xml:space="preserve"> y lo que se necesita ingresar de los que van a manejar el sistema en este caso solo usuario y contraseña</w:t>
+        <w:t>Todo lo relacionado con la tabla admin y lo que se necesita ingresar de los que van a manejar el sistema en este caso solo usuario y contraseña</w:t>
       </w:r>
     </w:p>
     <w:p>
@@ -861,7 +835,6 @@
       <w:r>
         <w:br/>
       </w:r>
-      <w:proofErr w:type="spellStart"/>
       <w:r>
         <w:rPr>
           <w:rFonts w:ascii="Calibri" w:eastAsia="Times New Roman" w:hAnsi="Calibri" w:cs="Calibri"/>
@@ -872,7 +845,6 @@
         </w:rPr>
         <w:t>Id_unico</w:t>
       </w:r>
-      <w:proofErr w:type="spellEnd"/>
     </w:p>
     <w:p>
       <w:pPr>
@@ -981,7 +953,6 @@
           <w14:ligatures w14:val="none"/>
         </w:rPr>
       </w:pPr>
-      <w:proofErr w:type="spellStart"/>
       <w:r>
         <w:rPr>
           <w:rFonts w:ascii="Calibri" w:eastAsia="Times New Roman" w:hAnsi="Calibri" w:cs="Calibri"/>
@@ -992,7 +963,6 @@
         </w:rPr>
         <w:t>Codigo</w:t>
       </w:r>
-      <w:proofErr w:type="spellEnd"/>
     </w:p>
     <w:p>
       <w:pPr>
@@ -1004,7 +974,6 @@
           <w14:ligatures w14:val="none"/>
         </w:rPr>
       </w:pPr>
-      <w:proofErr w:type="spellStart"/>
       <w:r>
         <w:rPr>
           <w:rFonts w:ascii="Calibri" w:eastAsia="Times New Roman" w:hAnsi="Calibri" w:cs="Calibri"/>
@@ -1015,7 +984,6 @@
         </w:rPr>
         <w:t>N_Producto</w:t>
       </w:r>
-      <w:proofErr w:type="spellEnd"/>
     </w:p>
     <w:p>
       <w:r>
@@ -1152,11 +1120,9 @@
       </w:r>
     </w:p>
     <w:p>
-      <w:proofErr w:type="spellStart"/>
       <w:r>
         <w:t>Veintecinco</w:t>
       </w:r>
-      <w:proofErr w:type="spellEnd"/>
     </w:p>
     <w:p>
       <w:r>
@@ -1164,41 +1130,18 @@
       </w:r>
     </w:p>
     <w:p>
-      <w:proofErr w:type="spellStart"/>
       <w:r>
         <w:t>Treintacinco</w:t>
       </w:r>
-      <w:proofErr w:type="spellEnd"/>
     </w:p>
     <w:p>
       <w:r>
         <w:br/>
-        <w:t xml:space="preserve">Esta tabla será algo que se convierte de </w:t>
-      </w:r>
-      <w:proofErr w:type="spellStart"/>
-      <w:r>
-        <w:t>cvc</w:t>
-      </w:r>
-      <w:proofErr w:type="spellEnd"/>
-      <w:r>
-        <w:t xml:space="preserve"> a </w:t>
-      </w:r>
-      <w:proofErr w:type="spellStart"/>
-      <w:r>
-        <w:t>json</w:t>
-      </w:r>
-      <w:proofErr w:type="spellEnd"/>
-      <w:r>
-        <w:t xml:space="preserve"> para los productos que contiene </w:t>
-      </w:r>
-      <w:r>
-        <w:t xml:space="preserve">ya convertidos del </w:t>
-      </w:r>
-      <w:proofErr w:type="spellStart"/>
-      <w:r>
-        <w:t>pdf</w:t>
-      </w:r>
-      <w:proofErr w:type="spellEnd"/>
+        <w:t xml:space="preserve">Esta tabla será algo que se convierte de cvc a json para los productos que contiene </w:t>
+      </w:r>
+      <w:r>
+        <w:t>ya convertidos del pdf</w:t>
+      </w:r>
       <w:r>
         <w:br/>
       </w:r>
@@ -1222,7 +1165,6 @@
         </w:rPr>
         <w:t xml:space="preserve">Con la tabla </w:t>
       </w:r>
-      <w:proofErr w:type="spellStart"/>
       <w:r>
         <w:rPr>
           <w:b/>
@@ -1239,17 +1181,7 @@
           <w:sz w:val="28"/>
           <w:szCs w:val="28"/>
         </w:rPr>
-        <w:t>_p</w:t>
-      </w:r>
-      <w:proofErr w:type="spellEnd"/>
-      <w:r>
-        <w:rPr>
-          <w:b/>
-          <w:bCs/>
-          <w:sz w:val="28"/>
-          <w:szCs w:val="28"/>
-        </w:rPr>
-        <w:t>:</w:t>
+        <w:t>_p:</w:t>
       </w:r>
     </w:p>
     <w:p>
@@ -1331,7 +1263,6 @@
         <w:lastRenderedPageBreak/>
         <w:t xml:space="preserve">Con la tabla </w:t>
       </w:r>
-      <w:proofErr w:type="spellStart"/>
       <w:r>
         <w:rPr>
           <w:b/>
@@ -1350,7 +1281,6 @@
         </w:rPr>
         <w:t>_Yanbal</w:t>
       </w:r>
-      <w:proofErr w:type="spellEnd"/>
       <w:r>
         <w:rPr>
           <w:b/>
@@ -1396,14 +1326,15 @@
         <w:rPr>
           <w:sz w:val="28"/>
           <w:szCs w:val="28"/>
-        </w:rPr>
-      </w:pPr>
-      <w:r>
-        <w:rPr>
-          <w:sz w:val="28"/>
-          <w:szCs w:val="28"/>
-        </w:rPr>
-        <w:t>Abonos</w:t>
+          <w:u w:val="single"/>
+        </w:rPr>
+      </w:pPr>
+      <w:r>
+        <w:rPr>
+          <w:sz w:val="28"/>
+          <w:szCs w:val="28"/>
+        </w:rPr>
+        <w:t>Deuda</w:t>
       </w:r>
     </w:p>
     <w:p>
@@ -1481,12 +1412,17 @@
     <w:p>
       <w:pPr>
         <w:rPr>
-          <w:b/>
-          <w:bCs/>
-          <w:sz w:val="28"/>
-          <w:szCs w:val="28"/>
-        </w:rPr>
-      </w:pPr>
+          <w:sz w:val="28"/>
+          <w:szCs w:val="28"/>
+        </w:rPr>
+      </w:pPr>
+      <w:r>
+        <w:rPr>
+          <w:sz w:val="28"/>
+          <w:szCs w:val="28"/>
+        </w:rPr>
+        <w:t>Esta tabla es para agregar todos los depósitos que se hacen para guardarlos y registrarlos</w:t>
+      </w:r>
     </w:p>
     <w:p>
       <w:pPr>
@@ -1575,6 +1511,13 @@
           <w:szCs w:val="28"/>
         </w:rPr>
       </w:pPr>
+      <w:r>
+        <w:rPr>
+          <w:sz w:val="28"/>
+          <w:szCs w:val="28"/>
+        </w:rPr>
+        <w:br/>
+      </w:r>
     </w:p>
     <w:p>
       <w:pPr>

</xml_diff>